<commit_message>
update the prompt here
</commit_message>
<xml_diff>
--- a/uploaded_resumes/SantiReddy resume (6).docx
+++ b/uploaded_resumes/SantiReddy resume (6).docx
@@ -1028,8 +1028,13 @@
         </w:numPr>
         <w:ind w:right="173" w:hanging="360"/>
       </w:pPr>
-      <w:r>
-        <w:t xml:space="preserve">Well acquainted with Software Development </w:t>
+      <w:proofErr w:type="gramStart"/>
+      <w:r>
+        <w:t>Well</w:t>
+      </w:r>
+      <w:proofErr w:type="gramEnd"/>
+      <w:r>
+        <w:t xml:space="preserve"> acquainted with Software Development </w:t>
       </w:r>
       <w:proofErr w:type="spellStart"/>
       <w:proofErr w:type="gramStart"/>
@@ -2947,13 +2952,8 @@
         </w:numPr>
         <w:ind w:right="173" w:hanging="365"/>
       </w:pPr>
-      <w:proofErr w:type="spellStart"/>
-      <w:r>
-        <w:t>VaultDrawerMaintenance</w:t>
-      </w:r>
-      <w:proofErr w:type="spellEnd"/>
-      <w:r>
-        <w:t xml:space="preserve">. </w:t>
+      <w:r>
+        <w:t xml:space="preserve">VaultDrawerMaintenance. </w:t>
       </w:r>
     </w:p>
     <w:p>
@@ -6634,13 +6634,13 @@
             <w:pict>
               <v:group w14:anchorId="7DA38636" id="Group 1226967384" o:spid="_x0000_s1026" style="position:absolute;margin-left:464.55pt;margin-top:-4pt;width:27.55pt;height:44.4pt;z-index:251673600" coordsize="3498,5638" o:gfxdata="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">
                 <v:shape id="Picture 1670884746" o:spid="_x0000_s1027" type="#_x0000_t75" style="position:absolute;left:486;width:1704;height:1767;visibility:visible;mso-wrap-style:square" o:gfxdata="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">
-                  <v:imagedata r:id="rId11" o:title=""/>
+                  <v:imagedata r:id="rId15" o:title=""/>
                 </v:shape>
                 <v:shape id="Picture 1537187255" o:spid="_x0000_s1028" type="#_x0000_t75" style="position:absolute;top:1920;width:1642;height:1768;visibility:visible;mso-wrap-style:square" o:gfxdata="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">
-                  <v:imagedata r:id="rId11" o:title=""/>
+                  <v:imagedata r:id="rId15" o:title=""/>
                 </v:shape>
                 <v:shape id="Picture 502000370" o:spid="_x0000_s1029" type="#_x0000_t75" style="position:absolute;left:1794;top:3870;width:1704;height:1768;visibility:visible;mso-wrap-style:square" o:gfxdata="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">
-                  <v:imagedata r:id="rId11" o:title=""/>
+                  <v:imagedata r:id="rId15" o:title=""/>
                 </v:shape>
                 <w10:wrap type="square"/>
               </v:group>
@@ -7079,7 +7079,7 @@
                           <pic:cNvPicPr/>
                         </pic:nvPicPr>
                         <pic:blipFill>
-                          <a:blip r:embed="rId15"/>
+                          <a:blip r:embed="rId16"/>
                           <a:stretch>
                             <a:fillRect/>
                           </a:stretch>
@@ -7110,7 +7110,7 @@
                   <v:imagedata r:id="rId14"/>
                 </v:shape>
                 <v:shape id="Picture 1250" style="position:absolute;width:2921;height:1764;left:78;top:0;" filled="f">
-                  <v:imagedata r:id="rId16"/>
+                  <v:imagedata r:id="rId17"/>
                 </v:shape>
                 <w10:wrap type="square"/>
               </v:group>
@@ -7634,7 +7634,7 @@
                           <pic:cNvPicPr/>
                         </pic:nvPicPr>
                         <pic:blipFill>
-                          <a:blip r:embed="rId15"/>
+                          <a:blip r:embed="rId16"/>
                           <a:stretch>
                             <a:fillRect/>
                           </a:stretch>
@@ -7696,7 +7696,7 @@
                   </v:textbox>
                 </v:rect>
                 <v:shape id="Picture 1260" o:spid="_x0000_s1056" type="#_x0000_t75" style="position:absolute;left:4735;width:1766;height:1765;visibility:visible;mso-wrap-style:square" o:gfxdata="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">
-                  <v:imagedata r:id="rId17" o:title=""/>
+                  <v:imagedata r:id="rId18" o:title=""/>
                 </v:shape>
                 <v:shape id="Picture 1262" o:spid="_x0000_s1057" type="#_x0000_t75" style="position:absolute;top:1996;width:1701;height:1763;visibility:visible;mso-wrap-style:square" o:gfxdata="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">
                   <v:imagedata r:id="rId10" o:title=""/>

</xml_diff>